<commit_message>
Update Lab 4 report wording
</commit_message>
<xml_diff>
--- a/Lab-4/Lab4_Report.docx
+++ b/Lab-4/Lab4_Report.docx
@@ -35,7 +35,7 @@
     </w:p>
     <w:p>
       <w:r>
-        <w:t>The graph is S→A (1), S→B (4), A→C (2), B→G (5), C→G (3). Start is S and goal is G. The supplied heuristic is h(S)=5, h(A)=4, h(B)=4, h(C)=2, h(G)=0. A* uses f(n)=g(n)+h(n) and a priority queue; UCS is the same search with h(n)=0.</w:t>
+        <w:t>I used the supplied graph: S-A costs 1, S-B costs 4, A-C costs 2, B-G costs 5 and C-G costs 3. Start is S and goal is G. The supplied heuristic is h(S)=5, h(A)=4, h(B)=4, h(C)=2, h(G)=0. A* uses f(n)=g(n)+h(n) and a priority queue; UCS is the same search with h(n)=0.</w:t>
       </w:r>
     </w:p>
     <w:p>
@@ -988,7 +988,7 @@
     </w:p>
     <w:p>
       <w:r>
-        <w:t>Stale queue entries can appear when a better g value is discovered later. The implementation ignores an entry when its g differs from best[node]. This prevents processing obsolete paths. A second edge case is h(n)=0 everywhere: A* becomes UCS, so there is no heuristic efficiency benefit.</w:t>
+        <w:t>Stale queue entries can appear when a better g value is discovered later. The program skips an old queue entry when a better cost for that node was already found. This prevents processing obsolete paths. A second edge case is h(n)=0 everywhere: A* becomes UCS, so there is no heuristic efficiency benefit.</w:t>
       </w:r>
     </w:p>
     <w:p>
@@ -1077,6 +1077,13 @@
       </w:pPr>
       <w:r>
         <w:t>Russell &amp; Norvig, Artificial Intelligence: A Modern Approach, 4th ed., informed search: https://aima.cs.berkeley.edu/</w:t>
+      </w:r>
+    </w:p>
+    <w:p>
+      <w:r>
+        <w:br/>
+        <w:br/>
+        <w:t>Personal run note: I ran A* and UCS with the same graph. The normal heuristic returned cost 6, while changing only h(C) to 10 returned the cost-9 route, showing why overestimation matters.</w:t>
       </w:r>
     </w:p>
     <w:sectPr>

</xml_diff>